<commit_message>
Update Part 1.docx, add .gitignore
</commit_message>
<xml_diff>
--- a/Part 1.docx
+++ b/Part 1.docx
@@ -224,7 +224,6 @@
         <w:pStyle w:val="ListBullet"/>
       </w:pPr>
       <w:r>
-        <w:lastRenderedPageBreak/>
         <w:t>Ship features fast and keep the team unblocked</w:t>
       </w:r>
     </w:p>
@@ -249,6 +248,7 @@
         <w:pStyle w:val="ListBullet"/>
       </w:pPr>
       <w:r>
+        <w:lastRenderedPageBreak/>
         <w:t>Security feels like a blocker, not an enabler</w:t>
       </w:r>
     </w:p>
@@ -404,7 +404,6 @@
         <w:pStyle w:val="ListBullet"/>
       </w:pPr>
       <w:r>
-        <w:lastRenderedPageBreak/>
         <w:t>Internal champion activation: Identify the one security-conscious engineer inside the account. Arm them with a business case and a 1-hour setup guide to become the internal hero</w:t>
       </w:r>
     </w:p>
@@ -642,7 +641,28 @@
         <w:bidi/>
       </w:pPr>
       <w:r>
-        <w:t>לשמור על ה-pipelines מהירים ואוטומטיים</w:t>
+        <w:rPr>
+          <w:rFonts w:ascii="Segoe UI" w:hAnsi="Segoe UI" w:cs="Times New Roman"/>
+          <w:color w:val="202020"/>
+          <w:sz w:val="20"/>
+          <w:szCs w:val="20"/>
+          <w:shd w:val="clear" w:color="auto" w:fill="FAFAFD"/>
+          <w:rtl/>
+          <w:lang w:bidi="he-IL"/>
+        </w:rPr>
+        <w:lastRenderedPageBreak/>
+        <w:t>תהליכי הבנייה, הבדיקה והפריסה האוטומטיים של קוד</w:t>
+      </w:r>
+      <w:r>
+        <w:rPr>
+          <w:rFonts w:ascii="Segoe UI" w:hAnsi="Segoe UI" w:cs="Times New Roman"/>
+          <w:color w:val="202020"/>
+          <w:sz w:val="20"/>
+          <w:szCs w:val="20"/>
+          <w:shd w:val="clear" w:color="auto" w:fill="FAFAFD"/>
+          <w:lang w:bidi="he-IL"/>
+        </w:rPr>
+        <w:t xml:space="preserve"> CICD.</w:t>
       </w:r>
     </w:p>
     <w:p>
@@ -846,7 +866,6 @@
         <w:bidi/>
       </w:pPr>
       <w:r>
-        <w:lastRenderedPageBreak/>
         <w:t>לשלוח פיצ'רים מהר ולשמור על הצוות לא חסום</w:t>
       </w:r>
     </w:p>
@@ -1024,6 +1043,10 @@
     <w:p>
       <w:pPr>
         <w:bidi/>
+        <w:rPr>
+          <w:b/>
+          <w:rtl/>
+        </w:rPr>
       </w:pPr>
       <w:r>
         <w:rPr>
@@ -1034,61 +1057,516 @@
     </w:p>
     <w:p>
       <w:pPr>
-        <w:pStyle w:val="ListBullet"/>
+        <w:pStyle w:val="p1"/>
         <w:bidi/>
       </w:pPr>
       <w:r>
-        <w:t>פנייה פרואקטיבית מבוססת טריגר: כאשר הטלמטריה מראה אפס מדיניות אחרי 30 יום, CS מקבל אוטומטית התראה לפנות — לא לחכות שהלקוח יבקש עזרה</w:t>
-      </w:r>
-    </w:p>
-    <w:p>
-      <w:pPr>
-        <w:pStyle w:val="ListBullet"/>
+        <w:t xml:space="preserve">• </w:t>
+      </w:r>
+      <w:r>
+        <w:rPr>
+          <w:rStyle w:val="s1"/>
+          <w:b/>
+          <w:bCs/>
+        </w:rPr>
+        <w:t>Trigger-based proactive outreach (</w:t>
+      </w:r>
+      <w:r>
+        <w:rPr>
+          <w:rStyle w:val="s1"/>
+          <w:b/>
+          <w:bCs/>
+          <w:rtl/>
+        </w:rPr>
+        <w:t>פנייה יזומה מבוססת טריגר</w:t>
+      </w:r>
+      <w:r>
+        <w:rPr>
+          <w:rStyle w:val="s1"/>
+          <w:b/>
+          <w:bCs/>
+        </w:rPr>
+        <w:t>):</w:t>
+      </w:r>
+      <w:r>
+        <w:br/>
+      </w:r>
+      <w:r>
+        <w:rPr>
+          <w:rtl/>
+        </w:rPr>
+        <w:t>כאשר טלמטריה מראה שאין שום</w:t>
+      </w:r>
+      <w:r>
+        <w:t xml:space="preserve"> policies </w:t>
+      </w:r>
+      <w:r>
+        <w:rPr>
+          <w:rtl/>
+        </w:rPr>
+        <w:t>במשך 30 יום, צוות</w:t>
+      </w:r>
+      <w:r>
+        <w:t xml:space="preserve"> Customer Success </w:t>
+      </w:r>
+      <w:r>
+        <w:rPr>
+          <w:rtl/>
+        </w:rPr>
+        <w:t>מקבל התראה אוטומטית כדי לפנות ללקוח — לא מחכים שהלקוח יבקש עזרה בעצמו</w:t>
+      </w:r>
+      <w:r>
+        <w:t>.</w:t>
+      </w:r>
+    </w:p>
+    <w:p>
+      <w:r>
+        <w:rPr>
+          <w:noProof/>
+        </w:rPr>
+        <w:pict w14:anchorId="6F608C9E">
+          <v:rect id="_x0000_i1029" alt="" style="width:431.95pt;height:.05pt;mso-width-percent:0;mso-height-percent:0;mso-width-percent:0;mso-height-percent:0" o:hrpct="923" o:hralign="center" o:hrstd="t" o:hr="t" fillcolor="#a0a0a0" stroked="f"/>
+        </w:pict>
+      </w:r>
+    </w:p>
+    <w:p>
+      <w:pPr>
+        <w:pStyle w:val="p1"/>
         <w:bidi/>
       </w:pPr>
       <w:r>
-        <w:t>יצירת רגע ערך: להריץ סריקה על 5 ה-repos המרכזיים של הלקוח ולשלוח דוח "הנה מה שמצאנו" לפני שביקשו. להשתמש בנתונים אמיתיים כדי ליצור דחיפות</w:t>
-      </w:r>
-    </w:p>
-    <w:p>
-      <w:pPr>
-        <w:pStyle w:val="ListBullet"/>
+        <w:t xml:space="preserve">• </w:t>
+      </w:r>
+      <w:r>
+        <w:rPr>
+          <w:rStyle w:val="s1"/>
+          <w:b/>
+          <w:bCs/>
+        </w:rPr>
+        <w:t>Value moment manufacturing (</w:t>
+      </w:r>
+      <w:r>
+        <w:rPr>
+          <w:rStyle w:val="s1"/>
+          <w:b/>
+          <w:bCs/>
+          <w:rtl/>
+        </w:rPr>
+        <w:t>יצירת “רגע ערך</w:t>
+      </w:r>
+      <w:r>
+        <w:rPr>
+          <w:rStyle w:val="s1"/>
+          <w:b/>
+          <w:bCs/>
+        </w:rPr>
+        <w:t>”):</w:t>
+      </w:r>
+      <w:r>
+        <w:br/>
+      </w:r>
+      <w:r>
+        <w:rPr>
+          <w:rtl/>
+        </w:rPr>
+        <w:t>מריצים סריקה על 5 ה־</w:t>
+      </w:r>
+      <w:r>
+        <w:t xml:space="preserve">repos </w:t>
+      </w:r>
+      <w:r>
+        <w:rPr>
+          <w:rtl/>
+        </w:rPr>
+        <w:t>המרכזיים של הלקוח ושולחים דוח בסגנון “זה מה שמצאנו אצלך” עוד לפני שהלקוח מבקש. משתמשים בנתונים אמיתיים כדי ליצור תחושת דחיפות, לא</w:t>
+      </w:r>
+      <w:r>
+        <w:t xml:space="preserve"> pitch </w:t>
+      </w:r>
+      <w:r>
+        <w:rPr>
+          <w:rtl/>
+        </w:rPr>
+        <w:t>מכירתי</w:t>
+      </w:r>
+      <w:r>
+        <w:t>.</w:t>
+      </w:r>
+    </w:p>
+    <w:p>
+      <w:pPr>
         <w:bidi/>
       </w:pPr>
       <w:r>
-        <w:t>ניצול חדשות CVE: כאשר CVE גדול מתפרסם (Log4Shell, XZ Utils), לפנות ללקוחות רדומים: "אם Xray היה מוגדר, הייתם תופסים את זה לפני שהגיע לייצור"</w:t>
-      </w:r>
-    </w:p>
-    <w:p>
-      <w:pPr>
-        <w:pStyle w:val="ListBullet"/>
+        <w:rPr>
+          <w:noProof/>
+        </w:rPr>
+        <w:pict w14:anchorId="128669F6">
+          <v:rect id="_x0000_i1028" alt="" style="width:431.95pt;height:.05pt;mso-width-percent:0;mso-height-percent:0;mso-width-percent:0;mso-height-percent:0" o:hrpct="923" o:hralign="center" o:hrstd="t" o:hr="t" fillcolor="#a0a0a0" stroked="f"/>
+        </w:pict>
+      </w:r>
+    </w:p>
+    <w:p>
+      <w:pPr>
+        <w:pStyle w:val="p1"/>
         <w:bidi/>
       </w:pPr>
       <w:r>
-        <w:t>הפעלת אלוף פנימי: לזהות את המהנדס הבודד שאכפת לו מאבטחה בתוך הלקוח. לצייד אותו עם תיק עסקי ומדריך הגדרה של שעה כדי שיהפוך לגיבור פנימי</w:t>
-      </w:r>
-    </w:p>
-    <w:p>
-      <w:pPr>
-        <w:pStyle w:val="ListBullet"/>
+        <w:t xml:space="preserve">• </w:t>
+      </w:r>
+      <w:r>
+        <w:rPr>
+          <w:rStyle w:val="s1"/>
+          <w:b/>
+          <w:bCs/>
+        </w:rPr>
+        <w:t>CVE news-jacking (</w:t>
+      </w:r>
+      <w:r>
+        <w:rPr>
+          <w:rStyle w:val="s1"/>
+          <w:b/>
+          <w:bCs/>
+          <w:rtl/>
+        </w:rPr>
+        <w:t>תגובה לאירועי</w:t>
+      </w:r>
+      <w:r>
+        <w:rPr>
+          <w:rStyle w:val="s1"/>
+          <w:b/>
+          <w:bCs/>
+        </w:rPr>
+        <w:t xml:space="preserve"> CVE):</w:t>
+      </w:r>
+      <w:r>
+        <w:br/>
+      </w:r>
+      <w:r>
+        <w:rPr>
+          <w:rtl/>
+        </w:rPr>
+        <w:t>כאשר יוצאת חולשת אבטחה משמעותית (למשל</w:t>
+      </w:r>
+      <w:r>
+        <w:t xml:space="preserve"> Log4Shell </w:t>
+      </w:r>
+      <w:r>
+        <w:rPr>
+          <w:rtl/>
+        </w:rPr>
+        <w:t>או</w:t>
+      </w:r>
+      <w:r>
+        <w:t xml:space="preserve"> XZ Utils), </w:t>
+      </w:r>
+      <w:r>
+        <w:rPr>
+          <w:rtl/>
+        </w:rPr>
+        <w:t>פונים ללקוחות לא פעילים</w:t>
+      </w:r>
+      <w:r>
+        <w:t>:</w:t>
+      </w:r>
+      <w:r>
+        <w:br/>
+        <w:t>“</w:t>
+      </w:r>
+      <w:r>
+        <w:rPr>
+          <w:rtl/>
+        </w:rPr>
+        <w:t>אם</w:t>
+      </w:r>
+      <w:r>
+        <w:t xml:space="preserve"> Xray </w:t>
+      </w:r>
+      <w:r>
+        <w:rPr>
+          <w:rtl/>
+        </w:rPr>
+        <w:t>היה מוגדר אצלכם, הייתם מזהים את זה לפני שזה הגיע לפרודקשן</w:t>
+      </w:r>
+      <w:r>
+        <w:t>.”</w:t>
+      </w:r>
+    </w:p>
+    <w:p>
+      <w:pPr>
         <w:bidi/>
       </w:pPr>
       <w:r>
-        <w:t>השוואה עמיתים / לחץ חברתי: להציג נתונים אנונימיים — "לקוחות כמוכם מוגדרים עם X מדיניות ו-Y repos נסרקים." אף אחד לא רוצה להיות מתחת לחציון</w:t>
-      </w:r>
-    </w:p>
-    <w:p>
-      <w:pPr>
-        <w:pStyle w:val="ListBullet"/>
+        <w:rPr>
+          <w:noProof/>
+        </w:rPr>
+        <w:pict w14:anchorId="6B068073">
+          <v:rect id="_x0000_i1027" alt="" style="width:431.95pt;height:.05pt;mso-width-percent:0;mso-height-percent:0;mso-width-percent:0;mso-height-percent:0" o:hrpct="923" o:hralign="center" o:hrstd="t" o:hr="t" fillcolor="#a0a0a0" stroked="f"/>
+        </w:pict>
+      </w:r>
+    </w:p>
+    <w:p>
+      <w:pPr>
+        <w:pStyle w:val="p1"/>
         <w:bidi/>
       </w:pPr>
       <w:r>
-        <w:t>תזכורות מבוססות ציון: להגדיר Xray Adoption Health Score (0–100) ולשלוח התראות אוטומטיות כשלקוח קרוב למדרגה הבאה. ראות בנושא התקדמות יוצרת מומנטום</w:t>
+        <w:t xml:space="preserve">• </w:t>
+      </w:r>
+      <w:r>
+        <w:rPr>
+          <w:rStyle w:val="s1"/>
+          <w:b/>
+          <w:bCs/>
+        </w:rPr>
+        <w:t>Internal champion activation (</w:t>
+      </w:r>
+      <w:r>
+        <w:rPr>
+          <w:rStyle w:val="s1"/>
+          <w:b/>
+          <w:bCs/>
+          <w:rtl/>
+        </w:rPr>
+        <w:t>הפעלת שגריר פנימי</w:t>
+      </w:r>
+      <w:r>
+        <w:rPr>
+          <w:rStyle w:val="s1"/>
+          <w:b/>
+          <w:bCs/>
+        </w:rPr>
+        <w:t>):</w:t>
+      </w:r>
+      <w:r>
+        <w:br/>
+      </w:r>
+      <w:r>
+        <w:rPr>
+          <w:rtl/>
+        </w:rPr>
+        <w:t>מזהים את המהנדס הכי</w:t>
+      </w:r>
+      <w:r>
+        <w:t xml:space="preserve"> “security-conscious” </w:t>
+      </w:r>
+      <w:r>
+        <w:rPr>
+          <w:rtl/>
+        </w:rPr>
+        <w:t>בתוך הארגון. נותנים לו</w:t>
+      </w:r>
+      <w:r>
+        <w:t xml:space="preserve"> business case </w:t>
+      </w:r>
+      <w:r>
+        <w:rPr>
+          <w:rtl/>
+        </w:rPr>
+        <w:t>ברור ומדריך</w:t>
+      </w:r>
+      <w:r>
+        <w:t xml:space="preserve"> setup </w:t>
+      </w:r>
+      <w:r>
+        <w:rPr>
+          <w:rtl/>
+        </w:rPr>
+        <w:t>של שעה אחת כדי להפוך אותו ל־</w:t>
+      </w:r>
+      <w:r>
+        <w:t xml:space="preserve">internal champion </w:t>
+      </w:r>
+      <w:r>
+        <w:rPr>
+          <w:rtl/>
+        </w:rPr>
+        <w:t>שמקדם את המוצר מבפנים</w:t>
+      </w:r>
+      <w:r>
+        <w:t>.</w:t>
       </w:r>
     </w:p>
     <w:p>
       <w:pPr>
         <w:bidi/>
+      </w:pPr>
+      <w:r>
+        <w:rPr>
+          <w:noProof/>
+        </w:rPr>
+        <w:pict w14:anchorId="70A55A59">
+          <v:rect id="_x0000_i1026" alt="" style="width:431.95pt;height:.05pt;mso-width-percent:0;mso-height-percent:0;mso-width-percent:0;mso-height-percent:0" o:hrpct="923" o:hralign="center" o:hrstd="t" o:hr="t" fillcolor="#a0a0a0" stroked="f"/>
+        </w:pict>
+      </w:r>
+    </w:p>
+    <w:p>
+      <w:pPr>
+        <w:pStyle w:val="p1"/>
+        <w:bidi/>
+      </w:pPr>
+      <w:r>
+        <w:t xml:space="preserve">• </w:t>
+      </w:r>
+      <w:r>
+        <w:rPr>
+          <w:rStyle w:val="s1"/>
+          <w:b/>
+          <w:bCs/>
+        </w:rPr>
+        <w:t>Benchmarking / peer pressure (</w:t>
+      </w:r>
+      <w:r>
+        <w:rPr>
+          <w:rStyle w:val="s1"/>
+          <w:b/>
+          <w:bCs/>
+          <w:rtl/>
+        </w:rPr>
+        <w:t>השוואה ללחץ חברתי</w:t>
+      </w:r>
+      <w:r>
+        <w:rPr>
+          <w:rStyle w:val="s1"/>
+          <w:b/>
+          <w:bCs/>
+        </w:rPr>
+        <w:t>):</w:t>
+      </w:r>
+      <w:r>
+        <w:br/>
+      </w:r>
+      <w:r>
+        <w:rPr>
+          <w:rtl/>
+        </w:rPr>
+        <w:t>מציגים נתונים אנונימיים</w:t>
+      </w:r>
+      <w:r>
+        <w:t>:</w:t>
+      </w:r>
+      <w:r>
+        <w:br/>
+        <w:t>“</w:t>
+      </w:r>
+      <w:r>
+        <w:rPr>
+          <w:rtl/>
+        </w:rPr>
+        <w:t>לקוחות דומים לכם מריצים</w:t>
+      </w:r>
+      <w:r>
+        <w:t xml:space="preserve"> X policies </w:t>
+      </w:r>
+      <w:r>
+        <w:rPr>
+          <w:rtl/>
+        </w:rPr>
+        <w:t>ומסקרים</w:t>
+      </w:r>
+      <w:r>
+        <w:t xml:space="preserve"> Y repositories.”</w:t>
+      </w:r>
+      <w:r>
+        <w:br/>
+      </w:r>
+      <w:r>
+        <w:rPr>
+          <w:rtl/>
+        </w:rPr>
+        <w:t>כי אף אחד לא רוצה להיות מתחת לממוצע</w:t>
+      </w:r>
+      <w:r>
+        <w:t>.</w:t>
+      </w:r>
+    </w:p>
+    <w:p>
+      <w:pPr>
+        <w:bidi/>
+      </w:pPr>
+      <w:r>
+        <w:rPr>
+          <w:noProof/>
+        </w:rPr>
+        <w:pict w14:anchorId="4FF34E0A">
+          <v:rect id="_x0000_i1025" alt="" style="width:431.95pt;height:.05pt;mso-width-percent:0;mso-height-percent:0;mso-width-percent:0;mso-height-percent:0" o:hrpct="923" o:hralign="center" o:hrstd="t" o:hr="t" fillcolor="#a0a0a0" stroked="f"/>
+        </w:pict>
+      </w:r>
+    </w:p>
+    <w:p>
+      <w:pPr>
+        <w:pStyle w:val="p3"/>
+        <w:bidi/>
+      </w:pPr>
+      <w:r>
+        <w:lastRenderedPageBreak/>
+        <w:t xml:space="preserve">• </w:t>
+      </w:r>
+      <w:r>
+        <w:rPr>
+          <w:rStyle w:val="s1"/>
+          <w:b/>
+          <w:bCs/>
+        </w:rPr>
+        <w:t>Health score nudges (</w:t>
+      </w:r>
+      <w:r>
+        <w:rPr>
+          <w:rStyle w:val="s1"/>
+          <w:b/>
+          <w:bCs/>
+          <w:rtl/>
+        </w:rPr>
+        <w:t>דחיפות מבוססת מדד בריאות</w:t>
+      </w:r>
+      <w:r>
+        <w:rPr>
+          <w:rStyle w:val="s1"/>
+          <w:b/>
+          <w:bCs/>
+        </w:rPr>
+        <w:t>):</w:t>
+      </w:r>
+      <w:r>
+        <w:br/>
+      </w:r>
+      <w:r>
+        <w:rPr>
+          <w:rtl/>
+        </w:rPr>
+        <w:t>מגדירים</w:t>
+      </w:r>
+      <w:r>
+        <w:t xml:space="preserve"> Xray Adoption Health Score (0–100) </w:t>
+      </w:r>
+      <w:r>
+        <w:rPr>
+          <w:rtl/>
+        </w:rPr>
+        <w:t>ושולחים התראות אוטומטיות כשהלקוח מתקרב לאבן דרך הבאה</w:t>
+      </w:r>
+      <w:r>
+        <w:t>.</w:t>
+      </w:r>
+      <w:r>
+        <w:br/>
+      </w:r>
+      <w:r>
+        <w:rPr>
+          <w:rtl/>
+        </w:rPr>
+        <w:t>נראות של התקדמות יוצרת מומנטום ומעודדת אימוץ</w:t>
+      </w:r>
+      <w:r>
+        <w:t>.</w:t>
+      </w:r>
+    </w:p>
+    <w:p>
+      <w:pPr>
+        <w:bidi/>
+        <w:rPr>
+          <w:rFonts w:hint="cs"/>
+        </w:rPr>
       </w:pPr>
     </w:p>
     <w:p>
@@ -1191,6 +1669,25 @@
       </w:pPr>
       <w:r>
         <w:t>הגדרת ההתערבות המינימלית לתבנית ה-stuck הנפוצה ביותר</w:t>
+      </w:r>
+    </w:p>
+    <w:p>
+      <w:pPr>
+        <w:pStyle w:val="ListBullet"/>
+        <w:tabs>
+          <w:tab w:val="clear" w:pos="360"/>
+          <w:tab w:val="num" w:pos="720"/>
+        </w:tabs>
+        <w:bidi/>
+        <w:ind w:left="720"/>
+      </w:pPr>
+      <w:r>
+        <w:rPr>
+          <w:rFonts w:hint="cs"/>
+          <w:rtl/>
+          <w:lang w:bidi="he-IL"/>
+        </w:rPr>
+        <w:t>ביצוע הפעולה המינימלית שאני יכול לבצע כדי לשחרר את הלקוח.</w:t>
       </w:r>
     </w:p>
     <w:p>
@@ -1857,7 +2354,16 @@
   <w:style w:type="paragraph" w:default="1" w:styleId="Normal">
     <w:name w:val="Normal"/>
     <w:qFormat/>
-    <w:rsid w:val="00FC693F"/>
+    <w:rsid w:val="008F5866"/>
+    <w:pPr>
+      <w:spacing w:after="0" w:line="240" w:lineRule="auto"/>
+    </w:pPr>
+    <w:rPr>
+      <w:rFonts w:ascii="Times New Roman" w:eastAsia="Times New Roman" w:hAnsi="Times New Roman" w:cs="Times New Roman"/>
+      <w:sz w:val="24"/>
+      <w:szCs w:val="24"/>
+      <w:lang w:val="en-IL" w:bidi="he-IL"/>
+    </w:rPr>
   </w:style>
   <w:style w:type="paragraph" w:styleId="Heading1">
     <w:name w:val="heading 1"/>
@@ -1870,7 +2376,7 @@
     <w:pPr>
       <w:keepNext/>
       <w:keepLines/>
-      <w:spacing w:before="480" w:after="0"/>
+      <w:spacing w:before="480" w:line="276" w:lineRule="auto"/>
       <w:outlineLvl w:val="0"/>
     </w:pPr>
     <w:rPr>
@@ -1880,6 +2386,7 @@
       <w:color w:val="365F91" w:themeColor="accent1" w:themeShade="BF"/>
       <w:sz w:val="28"/>
       <w:szCs w:val="28"/>
+      <w:lang w:val="en-US" w:bidi="ar-SA"/>
     </w:rPr>
   </w:style>
   <w:style w:type="paragraph" w:styleId="Heading2">
@@ -1894,7 +2401,7 @@
     <w:pPr>
       <w:keepNext/>
       <w:keepLines/>
-      <w:spacing w:before="200" w:after="0"/>
+      <w:spacing w:before="200" w:line="276" w:lineRule="auto"/>
       <w:outlineLvl w:val="1"/>
     </w:pPr>
     <w:rPr>
@@ -1904,6 +2411,7 @@
       <w:color w:val="4F81BD" w:themeColor="accent1"/>
       <w:sz w:val="26"/>
       <w:szCs w:val="26"/>
+      <w:lang w:val="en-US" w:bidi="ar-SA"/>
     </w:rPr>
   </w:style>
   <w:style w:type="paragraph" w:styleId="Heading3">
@@ -1918,7 +2426,7 @@
     <w:pPr>
       <w:keepNext/>
       <w:keepLines/>
-      <w:spacing w:before="200" w:after="0"/>
+      <w:spacing w:before="200" w:line="276" w:lineRule="auto"/>
       <w:outlineLvl w:val="2"/>
     </w:pPr>
     <w:rPr>
@@ -1926,6 +2434,9 @@
       <w:b/>
       <w:bCs/>
       <w:color w:val="4F81BD" w:themeColor="accent1"/>
+      <w:sz w:val="22"/>
+      <w:szCs w:val="22"/>
+      <w:lang w:val="en-US" w:bidi="ar-SA"/>
     </w:rPr>
   </w:style>
   <w:style w:type="paragraph" w:styleId="Heading4">
@@ -1941,7 +2452,7 @@
     <w:pPr>
       <w:keepNext/>
       <w:keepLines/>
-      <w:spacing w:before="200" w:after="0"/>
+      <w:spacing w:before="200" w:line="276" w:lineRule="auto"/>
       <w:outlineLvl w:val="3"/>
     </w:pPr>
     <w:rPr>
@@ -1951,6 +2462,9 @@
       <w:i/>
       <w:iCs/>
       <w:color w:val="4F81BD" w:themeColor="accent1"/>
+      <w:sz w:val="22"/>
+      <w:szCs w:val="22"/>
+      <w:lang w:val="en-US" w:bidi="ar-SA"/>
     </w:rPr>
   </w:style>
   <w:style w:type="paragraph" w:styleId="Heading5">
@@ -1966,12 +2480,15 @@
     <w:pPr>
       <w:keepNext/>
       <w:keepLines/>
-      <w:spacing w:before="200" w:after="0"/>
+      <w:spacing w:before="200" w:line="276" w:lineRule="auto"/>
       <w:outlineLvl w:val="4"/>
     </w:pPr>
     <w:rPr>
       <w:rFonts w:asciiTheme="majorHAnsi" w:eastAsiaTheme="majorEastAsia" w:hAnsiTheme="majorHAnsi" w:cstheme="majorBidi"/>
       <w:color w:val="243F60" w:themeColor="accent1" w:themeShade="7F"/>
+      <w:sz w:val="22"/>
+      <w:szCs w:val="22"/>
+      <w:lang w:val="en-US" w:bidi="ar-SA"/>
     </w:rPr>
   </w:style>
   <w:style w:type="paragraph" w:styleId="Heading6">
@@ -1987,7 +2504,7 @@
     <w:pPr>
       <w:keepNext/>
       <w:keepLines/>
-      <w:spacing w:before="200" w:after="0"/>
+      <w:spacing w:before="200" w:line="276" w:lineRule="auto"/>
       <w:outlineLvl w:val="5"/>
     </w:pPr>
     <w:rPr>
@@ -1995,6 +2512,9 @@
       <w:i/>
       <w:iCs/>
       <w:color w:val="243F60" w:themeColor="accent1" w:themeShade="7F"/>
+      <w:sz w:val="22"/>
+      <w:szCs w:val="22"/>
+      <w:lang w:val="en-US" w:bidi="ar-SA"/>
     </w:rPr>
   </w:style>
   <w:style w:type="paragraph" w:styleId="Heading7">
@@ -2010,7 +2530,7 @@
     <w:pPr>
       <w:keepNext/>
       <w:keepLines/>
-      <w:spacing w:before="200" w:after="0"/>
+      <w:spacing w:before="200" w:line="276" w:lineRule="auto"/>
       <w:outlineLvl w:val="6"/>
     </w:pPr>
     <w:rPr>
@@ -2018,6 +2538,9 @@
       <w:i/>
       <w:iCs/>
       <w:color w:val="404040" w:themeColor="text1" w:themeTint="BF"/>
+      <w:sz w:val="22"/>
+      <w:szCs w:val="22"/>
+      <w:lang w:val="en-US" w:bidi="ar-SA"/>
     </w:rPr>
   </w:style>
   <w:style w:type="paragraph" w:styleId="Heading8">
@@ -2033,7 +2556,7 @@
     <w:pPr>
       <w:keepNext/>
       <w:keepLines/>
-      <w:spacing w:before="200" w:after="0"/>
+      <w:spacing w:before="200" w:line="276" w:lineRule="auto"/>
       <w:outlineLvl w:val="7"/>
     </w:pPr>
     <w:rPr>
@@ -2041,6 +2564,7 @@
       <w:color w:val="4F81BD" w:themeColor="accent1"/>
       <w:sz w:val="20"/>
       <w:szCs w:val="20"/>
+      <w:lang w:val="en-US" w:bidi="ar-SA"/>
     </w:rPr>
   </w:style>
   <w:style w:type="paragraph" w:styleId="Heading9">
@@ -2056,7 +2580,7 @@
     <w:pPr>
       <w:keepNext/>
       <w:keepLines/>
-      <w:spacing w:before="200" w:after="0"/>
+      <w:spacing w:before="200" w:line="276" w:lineRule="auto"/>
       <w:outlineLvl w:val="8"/>
     </w:pPr>
     <w:rPr>
@@ -2066,6 +2590,7 @@
       <w:color w:val="404040" w:themeColor="text1" w:themeTint="BF"/>
       <w:sz w:val="20"/>
       <w:szCs w:val="20"/>
+      <w:lang w:val="en-US" w:bidi="ar-SA"/>
     </w:rPr>
   </w:style>
   <w:style w:type="character" w:default="1" w:styleId="DefaultParagraphFont">
@@ -2107,8 +2632,13 @@
         <w:tab w:val="center" w:pos="4680"/>
         <w:tab w:val="right" w:pos="9360"/>
       </w:tabs>
-      <w:spacing w:after="0" w:line="240" w:lineRule="auto"/>
     </w:pPr>
+    <w:rPr>
+      <w:rFonts w:asciiTheme="minorHAnsi" w:eastAsiaTheme="minorEastAsia" w:hAnsiTheme="minorHAnsi" w:cstheme="minorBidi"/>
+      <w:sz w:val="22"/>
+      <w:szCs w:val="22"/>
+      <w:lang w:val="en-US" w:bidi="ar-SA"/>
+    </w:rPr>
   </w:style>
   <w:style w:type="character" w:customStyle="1" w:styleId="HeaderChar">
     <w:name w:val="Header Char"/>
@@ -2129,8 +2659,13 @@
         <w:tab w:val="center" w:pos="4680"/>
         <w:tab w:val="right" w:pos="9360"/>
       </w:tabs>
-      <w:spacing w:after="0" w:line="240" w:lineRule="auto"/>
     </w:pPr>
+    <w:rPr>
+      <w:rFonts w:asciiTheme="minorHAnsi" w:eastAsiaTheme="minorEastAsia" w:hAnsiTheme="minorHAnsi" w:cstheme="minorBidi"/>
+      <w:sz w:val="22"/>
+      <w:szCs w:val="22"/>
+      <w:lang w:val="en-US" w:bidi="ar-SA"/>
+    </w:rPr>
   </w:style>
   <w:style w:type="character" w:customStyle="1" w:styleId="FooterChar">
     <w:name w:val="Footer Char"/>
@@ -2203,7 +2738,7 @@
       <w:pBdr>
         <w:bottom w:val="single" w:sz="8" w:space="4" w:color="4F81BD" w:themeColor="accent1"/>
       </w:pBdr>
-      <w:spacing w:after="300" w:line="240" w:lineRule="auto"/>
+      <w:spacing w:after="300"/>
       <w:contextualSpacing/>
     </w:pPr>
     <w:rPr>
@@ -2213,6 +2748,7 @@
       <w:kern w:val="28"/>
       <w:sz w:val="52"/>
       <w:szCs w:val="52"/>
+      <w:lang w:val="en-US" w:bidi="ar-SA"/>
     </w:rPr>
   </w:style>
   <w:style w:type="character" w:customStyle="1" w:styleId="TitleChar">
@@ -2242,6 +2778,7 @@
       <w:numPr>
         <w:ilvl w:val="1"/>
       </w:numPr>
+      <w:spacing w:after="200" w:line="276" w:lineRule="auto"/>
     </w:pPr>
     <w:rPr>
       <w:rFonts w:asciiTheme="majorHAnsi" w:eastAsiaTheme="majorEastAsia" w:hAnsiTheme="majorHAnsi" w:cstheme="majorBidi"/>
@@ -2249,8 +2786,7 @@
       <w:iCs/>
       <w:color w:val="4F81BD" w:themeColor="accent1"/>
       <w:spacing w:val="15"/>
-      <w:sz w:val="24"/>
-      <w:szCs w:val="24"/>
+      <w:lang w:val="en-US" w:bidi="ar-SA"/>
     </w:rPr>
   </w:style>
   <w:style w:type="character" w:customStyle="1" w:styleId="SubtitleChar">
@@ -2276,9 +2812,16 @@
     <w:qFormat/>
     <w:rsid w:val="00FC693F"/>
     <w:pPr>
+      <w:spacing w:after="200" w:line="276" w:lineRule="auto"/>
       <w:ind w:left="720"/>
       <w:contextualSpacing/>
     </w:pPr>
+    <w:rPr>
+      <w:rFonts w:asciiTheme="minorHAnsi" w:eastAsiaTheme="minorEastAsia" w:hAnsiTheme="minorHAnsi" w:cstheme="minorBidi"/>
+      <w:sz w:val="22"/>
+      <w:szCs w:val="22"/>
+      <w:lang w:val="en-US" w:bidi="ar-SA"/>
+    </w:rPr>
   </w:style>
   <w:style w:type="paragraph" w:styleId="BodyText">
     <w:name w:val="Body Text"/>
@@ -2288,8 +2831,14 @@
     <w:unhideWhenUsed/>
     <w:rsid w:val="00AA1D8D"/>
     <w:pPr>
-      <w:spacing w:after="120"/>
+      <w:spacing w:after="120" w:line="276" w:lineRule="auto"/>
     </w:pPr>
+    <w:rPr>
+      <w:rFonts w:asciiTheme="minorHAnsi" w:eastAsiaTheme="minorEastAsia" w:hAnsiTheme="minorHAnsi" w:cstheme="minorBidi"/>
+      <w:sz w:val="22"/>
+      <w:szCs w:val="22"/>
+      <w:lang w:val="en-US" w:bidi="ar-SA"/>
+    </w:rPr>
   </w:style>
   <w:style w:type="character" w:customStyle="1" w:styleId="BodyTextChar">
     <w:name w:val="Body Text Char"/>
@@ -2308,6 +2857,12 @@
     <w:pPr>
       <w:spacing w:after="120" w:line="480" w:lineRule="auto"/>
     </w:pPr>
+    <w:rPr>
+      <w:rFonts w:asciiTheme="minorHAnsi" w:eastAsiaTheme="minorEastAsia" w:hAnsiTheme="minorHAnsi" w:cstheme="minorBidi"/>
+      <w:sz w:val="22"/>
+      <w:szCs w:val="22"/>
+      <w:lang w:val="en-US" w:bidi="ar-SA"/>
+    </w:rPr>
   </w:style>
   <w:style w:type="character" w:customStyle="1" w:styleId="BodyText2Char">
     <w:name w:val="Body Text 2 Char"/>
@@ -2324,11 +2879,13 @@
     <w:unhideWhenUsed/>
     <w:rsid w:val="00AA1D8D"/>
     <w:pPr>
-      <w:spacing w:after="120"/>
+      <w:spacing w:after="120" w:line="276" w:lineRule="auto"/>
     </w:pPr>
     <w:rPr>
+      <w:rFonts w:asciiTheme="minorHAnsi" w:eastAsiaTheme="minorEastAsia" w:hAnsiTheme="minorHAnsi" w:cstheme="minorBidi"/>
       <w:sz w:val="16"/>
       <w:szCs w:val="16"/>
+      <w:lang w:val="en-US" w:bidi="ar-SA"/>
     </w:rPr>
   </w:style>
   <w:style w:type="character" w:customStyle="1" w:styleId="BodyText3Char">
@@ -2349,9 +2906,16 @@
     <w:unhideWhenUsed/>
     <w:rsid w:val="00AA1D8D"/>
     <w:pPr>
+      <w:spacing w:after="200" w:line="276" w:lineRule="auto"/>
       <w:ind w:left="360" w:hanging="360"/>
       <w:contextualSpacing/>
     </w:pPr>
+    <w:rPr>
+      <w:rFonts w:asciiTheme="minorHAnsi" w:eastAsiaTheme="minorEastAsia" w:hAnsiTheme="minorHAnsi" w:cstheme="minorBidi"/>
+      <w:sz w:val="22"/>
+      <w:szCs w:val="22"/>
+      <w:lang w:val="en-US" w:bidi="ar-SA"/>
+    </w:rPr>
   </w:style>
   <w:style w:type="paragraph" w:styleId="List2">
     <w:name w:val="List 2"/>
@@ -2360,9 +2924,16 @@
     <w:unhideWhenUsed/>
     <w:rsid w:val="00326F90"/>
     <w:pPr>
+      <w:spacing w:after="200" w:line="276" w:lineRule="auto"/>
       <w:ind w:left="720" w:hanging="360"/>
       <w:contextualSpacing/>
     </w:pPr>
+    <w:rPr>
+      <w:rFonts w:asciiTheme="minorHAnsi" w:eastAsiaTheme="minorEastAsia" w:hAnsiTheme="minorHAnsi" w:cstheme="minorBidi"/>
+      <w:sz w:val="22"/>
+      <w:szCs w:val="22"/>
+      <w:lang w:val="en-US" w:bidi="ar-SA"/>
+    </w:rPr>
   </w:style>
   <w:style w:type="paragraph" w:styleId="List3">
     <w:name w:val="List 3"/>
@@ -2371,9 +2942,16 @@
     <w:unhideWhenUsed/>
     <w:rsid w:val="00326F90"/>
     <w:pPr>
+      <w:spacing w:after="200" w:line="276" w:lineRule="auto"/>
       <w:ind w:left="1080" w:hanging="360"/>
       <w:contextualSpacing/>
     </w:pPr>
+    <w:rPr>
+      <w:rFonts w:asciiTheme="minorHAnsi" w:eastAsiaTheme="minorEastAsia" w:hAnsiTheme="minorHAnsi" w:cstheme="minorBidi"/>
+      <w:sz w:val="22"/>
+      <w:szCs w:val="22"/>
+      <w:lang w:val="en-US" w:bidi="ar-SA"/>
+    </w:rPr>
   </w:style>
   <w:style w:type="paragraph" w:styleId="ListBullet">
     <w:name w:val="List Bullet"/>
@@ -2385,8 +2963,15 @@
       <w:numPr>
         <w:numId w:val="1"/>
       </w:numPr>
+      <w:spacing w:after="200" w:line="276" w:lineRule="auto"/>
       <w:contextualSpacing/>
     </w:pPr>
+    <w:rPr>
+      <w:rFonts w:asciiTheme="minorHAnsi" w:eastAsiaTheme="minorEastAsia" w:hAnsiTheme="minorHAnsi" w:cstheme="minorBidi"/>
+      <w:sz w:val="22"/>
+      <w:szCs w:val="22"/>
+      <w:lang w:val="en-US" w:bidi="ar-SA"/>
+    </w:rPr>
   </w:style>
   <w:style w:type="paragraph" w:styleId="ListBullet2">
     <w:name w:val="List Bullet 2"/>
@@ -2398,8 +2983,15 @@
       <w:numPr>
         <w:numId w:val="2"/>
       </w:numPr>
+      <w:spacing w:after="200" w:line="276" w:lineRule="auto"/>
       <w:contextualSpacing/>
     </w:pPr>
+    <w:rPr>
+      <w:rFonts w:asciiTheme="minorHAnsi" w:eastAsiaTheme="minorEastAsia" w:hAnsiTheme="minorHAnsi" w:cstheme="minorBidi"/>
+      <w:sz w:val="22"/>
+      <w:szCs w:val="22"/>
+      <w:lang w:val="en-US" w:bidi="ar-SA"/>
+    </w:rPr>
   </w:style>
   <w:style w:type="paragraph" w:styleId="ListBullet3">
     <w:name w:val="List Bullet 3"/>
@@ -2411,8 +3003,15 @@
       <w:numPr>
         <w:numId w:val="3"/>
       </w:numPr>
+      <w:spacing w:after="200" w:line="276" w:lineRule="auto"/>
       <w:contextualSpacing/>
     </w:pPr>
+    <w:rPr>
+      <w:rFonts w:asciiTheme="minorHAnsi" w:eastAsiaTheme="minorEastAsia" w:hAnsiTheme="minorHAnsi" w:cstheme="minorBidi"/>
+      <w:sz w:val="22"/>
+      <w:szCs w:val="22"/>
+      <w:lang w:val="en-US" w:bidi="ar-SA"/>
+    </w:rPr>
   </w:style>
   <w:style w:type="paragraph" w:styleId="ListNumber">
     <w:name w:val="List Number"/>
@@ -2424,8 +3023,15 @@
       <w:numPr>
         <w:numId w:val="5"/>
       </w:numPr>
+      <w:spacing w:after="200" w:line="276" w:lineRule="auto"/>
       <w:contextualSpacing/>
     </w:pPr>
+    <w:rPr>
+      <w:rFonts w:asciiTheme="minorHAnsi" w:eastAsiaTheme="minorEastAsia" w:hAnsiTheme="minorHAnsi" w:cstheme="minorBidi"/>
+      <w:sz w:val="22"/>
+      <w:szCs w:val="22"/>
+      <w:lang w:val="en-US" w:bidi="ar-SA"/>
+    </w:rPr>
   </w:style>
   <w:style w:type="paragraph" w:styleId="ListNumber2">
     <w:name w:val="List Number 2"/>
@@ -2437,8 +3043,15 @@
       <w:numPr>
         <w:numId w:val="6"/>
       </w:numPr>
+      <w:spacing w:after="200" w:line="276" w:lineRule="auto"/>
       <w:contextualSpacing/>
     </w:pPr>
+    <w:rPr>
+      <w:rFonts w:asciiTheme="minorHAnsi" w:eastAsiaTheme="minorEastAsia" w:hAnsiTheme="minorHAnsi" w:cstheme="minorBidi"/>
+      <w:sz w:val="22"/>
+      <w:szCs w:val="22"/>
+      <w:lang w:val="en-US" w:bidi="ar-SA"/>
+    </w:rPr>
   </w:style>
   <w:style w:type="paragraph" w:styleId="ListNumber3">
     <w:name w:val="List Number 3"/>
@@ -2450,8 +3063,15 @@
       <w:numPr>
         <w:numId w:val="7"/>
       </w:numPr>
+      <w:spacing w:after="200" w:line="276" w:lineRule="auto"/>
       <w:contextualSpacing/>
     </w:pPr>
+    <w:rPr>
+      <w:rFonts w:asciiTheme="minorHAnsi" w:eastAsiaTheme="minorEastAsia" w:hAnsiTheme="minorHAnsi" w:cstheme="minorBidi"/>
+      <w:sz w:val="22"/>
+      <w:szCs w:val="22"/>
+      <w:lang w:val="en-US" w:bidi="ar-SA"/>
+    </w:rPr>
   </w:style>
   <w:style w:type="paragraph" w:styleId="ListContinue">
     <w:name w:val="List Continue"/>
@@ -2460,10 +3080,16 @@
     <w:unhideWhenUsed/>
     <w:rsid w:val="0029639D"/>
     <w:pPr>
-      <w:spacing w:after="120"/>
+      <w:spacing w:after="120" w:line="276" w:lineRule="auto"/>
       <w:ind w:left="360"/>
       <w:contextualSpacing/>
     </w:pPr>
+    <w:rPr>
+      <w:rFonts w:asciiTheme="minorHAnsi" w:eastAsiaTheme="minorEastAsia" w:hAnsiTheme="minorHAnsi" w:cstheme="minorBidi"/>
+      <w:sz w:val="22"/>
+      <w:szCs w:val="22"/>
+      <w:lang w:val="en-US" w:bidi="ar-SA"/>
+    </w:rPr>
   </w:style>
   <w:style w:type="paragraph" w:styleId="ListContinue2">
     <w:name w:val="List Continue 2"/>
@@ -2472,10 +3098,16 @@
     <w:unhideWhenUsed/>
     <w:rsid w:val="0029639D"/>
     <w:pPr>
-      <w:spacing w:after="120"/>
+      <w:spacing w:after="120" w:line="276" w:lineRule="auto"/>
       <w:ind w:left="720"/>
       <w:contextualSpacing/>
     </w:pPr>
+    <w:rPr>
+      <w:rFonts w:asciiTheme="minorHAnsi" w:eastAsiaTheme="minorEastAsia" w:hAnsiTheme="minorHAnsi" w:cstheme="minorBidi"/>
+      <w:sz w:val="22"/>
+      <w:szCs w:val="22"/>
+      <w:lang w:val="en-US" w:bidi="ar-SA"/>
+    </w:rPr>
   </w:style>
   <w:style w:type="paragraph" w:styleId="ListContinue3">
     <w:name w:val="List Continue 3"/>
@@ -2484,10 +3116,16 @@
     <w:unhideWhenUsed/>
     <w:rsid w:val="0029639D"/>
     <w:pPr>
-      <w:spacing w:after="120"/>
+      <w:spacing w:after="120" w:line="276" w:lineRule="auto"/>
       <w:ind w:left="1080"/>
       <w:contextualSpacing/>
     </w:pPr>
+    <w:rPr>
+      <w:rFonts w:asciiTheme="minorHAnsi" w:eastAsiaTheme="minorEastAsia" w:hAnsiTheme="minorHAnsi" w:cstheme="minorBidi"/>
+      <w:sz w:val="22"/>
+      <w:szCs w:val="22"/>
+      <w:lang w:val="en-US" w:bidi="ar-SA"/>
+    </w:rPr>
   </w:style>
   <w:style w:type="paragraph" w:styleId="MacroText">
     <w:name w:val="macro"/>
@@ -2532,10 +3170,17 @@
     <w:uiPriority w:val="29"/>
     <w:qFormat/>
     <w:rsid w:val="00FC693F"/>
+    <w:pPr>
+      <w:spacing w:after="200" w:line="276" w:lineRule="auto"/>
+    </w:pPr>
     <w:rPr>
+      <w:rFonts w:asciiTheme="minorHAnsi" w:eastAsiaTheme="minorEastAsia" w:hAnsiTheme="minorHAnsi" w:cstheme="minorBidi"/>
       <w:i/>
       <w:iCs/>
       <w:color w:val="000000" w:themeColor="text1"/>
+      <w:sz w:val="22"/>
+      <w:szCs w:val="22"/>
+      <w:lang w:val="en-US" w:bidi="ar-SA"/>
     </w:rPr>
   </w:style>
   <w:style w:type="character" w:customStyle="1" w:styleId="QuoteChar">
@@ -2646,14 +3291,16 @@
     <w:qFormat/>
     <w:rsid w:val="00FC693F"/>
     <w:pPr>
-      <w:spacing w:line="240" w:lineRule="auto"/>
+      <w:spacing w:after="200"/>
     </w:pPr>
     <w:rPr>
+      <w:rFonts w:asciiTheme="minorHAnsi" w:eastAsiaTheme="minorEastAsia" w:hAnsiTheme="minorHAnsi" w:cstheme="minorBidi"/>
       <w:b/>
       <w:bCs/>
       <w:color w:val="4F81BD" w:themeColor="accent1"/>
       <w:sz w:val="18"/>
       <w:szCs w:val="18"/>
+      <w:lang w:val="en-US" w:bidi="ar-SA"/>
     </w:rPr>
   </w:style>
   <w:style w:type="character" w:styleId="Strong">
@@ -2690,15 +3337,19 @@
       <w:pBdr>
         <w:bottom w:val="single" w:sz="4" w:space="4" w:color="4F81BD" w:themeColor="accent1"/>
       </w:pBdr>
-      <w:spacing w:before="200" w:after="280"/>
+      <w:spacing w:before="200" w:after="280" w:line="276" w:lineRule="auto"/>
       <w:ind w:left="936" w:right="936"/>
     </w:pPr>
     <w:rPr>
+      <w:rFonts w:asciiTheme="minorHAnsi" w:eastAsiaTheme="minorEastAsia" w:hAnsiTheme="minorHAnsi" w:cstheme="minorBidi"/>
       <w:b/>
       <w:bCs/>
       <w:i/>
       <w:iCs/>
       <w:color w:val="4F81BD" w:themeColor="accent1"/>
+      <w:sz w:val="22"/>
+      <w:szCs w:val="22"/>
+      <w:lang w:val="en-US" w:bidi="ar-SA"/>
     </w:rPr>
   </w:style>
   <w:style w:type="character" w:customStyle="1" w:styleId="IntenseQuoteChar">
@@ -12847,6 +13498,27 @@
         <w:shd w:val="clear" w:color="auto" w:fill="FBCAA2" w:themeFill="accent6" w:themeFillTint="7F"/>
       </w:tcPr>
     </w:tblStylePr>
+  </w:style>
+  <w:style w:type="paragraph" w:customStyle="1" w:styleId="p1">
+    <w:name w:val="p1"/>
+    <w:basedOn w:val="Normal"/>
+    <w:rsid w:val="008F5866"/>
+    <w:pPr>
+      <w:spacing w:before="100" w:beforeAutospacing="1" w:after="100" w:afterAutospacing="1"/>
+    </w:pPr>
+  </w:style>
+  <w:style w:type="character" w:customStyle="1" w:styleId="s1">
+    <w:name w:val="s1"/>
+    <w:basedOn w:val="DefaultParagraphFont"/>
+    <w:rsid w:val="008F5866"/>
+  </w:style>
+  <w:style w:type="paragraph" w:customStyle="1" w:styleId="p3">
+    <w:name w:val="p3"/>
+    <w:basedOn w:val="Normal"/>
+    <w:rsid w:val="008F5866"/>
+    <w:pPr>
+      <w:spacing w:before="100" w:beforeAutospacing="1" w:after="100" w:afterAutospacing="1"/>
+    </w:pPr>
   </w:style>
 </w:styles>
 </file>

</xml_diff>